<commit_message>
feat: add member blueprint, admin user management views, and update app routing
</commit_message>
<xml_diff>
--- a/file/走吧揪團 AI多人協作旅遊規劃系統.docx
+++ b/file/走吧揪團 AI多人協作旅遊規劃系統.docx
@@ -293,19 +293,17 @@
         <w:rPr>
           <w:rFonts w:hint="eastAsia"/>
         </w:rPr>
-        <w:t>系統管理員負責管理會員帳號、旅遊內容管理員帳號、公開內容、檢舉、公告、</w:t>
-      </w:r>
-      <w:r>
-        <w:rPr>
-          <w:rFonts w:hint="eastAsia"/>
-        </w:rPr>
-        <w:t>AI</w:t>
-      </w:r>
-      <w:r>
-        <w:rPr>
-          <w:rFonts w:hint="eastAsia"/>
-        </w:rPr>
-        <w:t>使用紀錄、系統統計、操作紀錄、安全及資料庫備份。</w:t>
+        <w:t>系統管理員負責管理會員帳號、旅遊內容管理員帳號、公開內容、問題回報、公告、AI使用紀錄、系統統計、操作紀錄、安全及資料庫備份。</w:t>
+      </w:r>
+      <w:r>
+        <w:rPr>
+          <w:rFonts w:hint="eastAsia"/>
+        </w:rPr>
+      </w:r>
+      <w:r>
+        <w:rPr>
+          <w:rFonts w:hint="eastAsia"/>
+        </w:rPr>
       </w:r>
     </w:p>
     <w:p>
@@ -6691,7 +6689,7 @@
         <w:rPr>
           <w:rFonts w:hint="eastAsia"/>
         </w:rPr>
-        <w:t>留言者可刪除自己的留言；系統管理員可以處理被檢舉的留言。</w:t>
+        <w:t>留言者可刪除自己的留言；系統管理員可以處理留言相關的問題回報。</w:t>
       </w:r>
     </w:p>
     <w:p>
@@ -6701,13 +6699,12 @@
       <w:bookmarkStart w:id="90" w:name="檢舉留言"/>
       <w:bookmarkEnd w:id="89"/>
       <w:r>
-        <w:t xml:space="preserve">5. </w:t>
-      </w:r>
-      <w:r>
-        <w:rPr>
-          <w:rFonts w:hint="eastAsia"/>
-        </w:rPr>
-        <w:t>檢舉留言</w:t>
+        <w:t>5. 留言問題回報</w:t>
+      </w:r>
+      <w:r>
+        <w:rPr>
+          <w:rFonts w:hint="eastAsia"/>
+        </w:rPr>
       </w:r>
     </w:p>
     <w:p>
@@ -6718,7 +6715,7 @@
         <w:rPr>
           <w:rFonts w:hint="eastAsia"/>
         </w:rPr>
-        <w:t>成員可以選擇檢舉原因並送交系統管理員處理。</w:t>
+        <w:t>成員可以選擇問題類型並填寫說明，送交系統管理員處理。</w:t>
       </w:r>
     </w:p>
     <w:p>
@@ -12741,7 +12738,7 @@
         <w:rPr>
           <w:rFonts w:hint="eastAsia"/>
         </w:rPr>
-        <w:t>待處理檢舉數量</w:t>
+        <w:t>待處理問題回報數量</w:t>
       </w:r>
     </w:p>
     <w:p>
@@ -12893,7 +12890,7 @@
         <w:rPr>
           <w:rFonts w:hint="eastAsia"/>
         </w:rPr>
-        <w:t>查看會員被檢舉紀錄</w:t>
+        <w:t>查看會員提出的問題回報紀錄</w:t>
       </w:r>
     </w:p>
     <w:p>
@@ -13513,7 +13510,7 @@
         <w:rPr>
           <w:rFonts w:hint="eastAsia"/>
         </w:rPr>
-        <w:t>（七）檢舉管理</w:t>
+        <w:t>（七）問題回報管理</w:t>
       </w:r>
     </w:p>
     <w:p>
@@ -13539,7 +13536,7 @@
         <w:rPr>
           <w:rFonts w:hint="eastAsia"/>
         </w:rPr>
-        <w:t>留言檢舉</w:t>
+        <w:t>留言問題回報</w:t>
       </w:r>
     </w:p>
     <w:p>
@@ -13554,7 +13551,7 @@
         <w:rPr>
           <w:rFonts w:hint="eastAsia"/>
         </w:rPr>
-        <w:t>公開行程檢舉</w:t>
+        <w:t>公開行程問題回報</w:t>
       </w:r>
     </w:p>
     <w:p>
@@ -13569,7 +13566,7 @@
         <w:rPr>
           <w:rFonts w:hint="eastAsia"/>
         </w:rPr>
-        <w:t>旅遊手冊檢舉</w:t>
+        <w:t>旅遊手冊問題回報</w:t>
       </w:r>
     </w:p>
     <w:p>
@@ -13584,7 +13581,7 @@
         <w:rPr>
           <w:rFonts w:hint="eastAsia"/>
         </w:rPr>
-        <w:t>會員檢舉</w:t>
+        <w:t>會員問題回報</w:t>
       </w:r>
     </w:p>
     <w:p>
@@ -13610,7 +13607,7 @@
         <w:rPr>
           <w:rFonts w:hint="eastAsia"/>
         </w:rPr>
-        <w:t>查看檢舉內容</w:t>
+        <w:t>查看問題回報內容</w:t>
       </w:r>
     </w:p>
     <w:p>
@@ -13625,7 +13622,7 @@
         <w:rPr>
           <w:rFonts w:hint="eastAsia"/>
         </w:rPr>
-        <w:t>查看檢舉人</w:t>
+        <w:t>查看回報會員</w:t>
       </w:r>
     </w:p>
     <w:p>
@@ -13640,7 +13637,7 @@
         <w:rPr>
           <w:rFonts w:hint="eastAsia"/>
         </w:rPr>
-        <w:t>查看被檢舉人</w:t>
+        <w:t>查看相關會員或內容建立者</w:t>
       </w:r>
     </w:p>
     <w:p>
@@ -13655,7 +13652,7 @@
         <w:rPr>
           <w:rFonts w:hint="eastAsia"/>
         </w:rPr>
-        <w:t>查看檢舉原因</w:t>
+        <w:t>查看問題類型與說明</w:t>
       </w:r>
     </w:p>
     <w:p>
@@ -13685,8 +13682,7 @@
         <w:rPr>
           <w:rFonts w:hint="eastAsia"/>
         </w:rPr>
-        <w:lastRenderedPageBreak/>
-        <w:t>判定檢舉成立</w:t>
+        <w:t>將問題回報標記為已結案</w:t>
       </w:r>
     </w:p>
     <w:p>
@@ -13701,7 +13697,7 @@
         <w:rPr>
           <w:rFonts w:hint="eastAsia"/>
         </w:rPr>
-        <w:t>判定檢舉不成立</w:t>
+        <w:t>將問題回報標記為已駁回</w:t>
       </w:r>
     </w:p>
     <w:p>
@@ -13716,7 +13712,7 @@
         <w:rPr>
           <w:rFonts w:hint="eastAsia"/>
         </w:rPr>
-        <w:t>隱藏或刪除違規內容</w:t>
+        <w:t>依處理結果取消公開或恢復公開內容</w:t>
       </w:r>
     </w:p>
     <w:p>
@@ -13731,7 +13727,7 @@
         <w:rPr>
           <w:rFonts w:hint="eastAsia"/>
         </w:rPr>
-        <w:t>停用違規帳號</w:t>
+        <w:t>必要時停用相關帳號</w:t>
       </w:r>
     </w:p>
     <w:p>
@@ -14564,7 +14560,7 @@
         <w:rPr>
           <w:rFonts w:hint="eastAsia"/>
         </w:rPr>
-        <w:t>處理檢舉</w:t>
+        <w:t>處理問題回報</w:t>
       </w:r>
     </w:p>
     <w:p>
@@ -14788,7 +14784,7 @@
         <w:rPr>
           <w:rFonts w:hint="eastAsia"/>
         </w:rPr>
-        <w:t>檢舉數量</w:t>
+        <w:t>問題回報數量</w:t>
       </w:r>
     </w:p>
     <w:p>
@@ -14803,7 +14799,7 @@
         <w:rPr>
           <w:rFonts w:hint="eastAsia"/>
         </w:rPr>
-        <w:t>檢舉成立比例</w:t>
+        <w:t>問題回報結案比例</w:t>
       </w:r>
     </w:p>
     <w:p>
@@ -15046,7 +15042,7 @@
         <w:rPr>
           <w:rFonts w:hint="eastAsia"/>
         </w:rPr>
-        <w:t>檢舉處理報表</w:t>
+        <w:t>問題回報處理報表</w:t>
       </w:r>
     </w:p>
     <w:p>
@@ -15676,7 +15672,7 @@
         <w:rPr>
           <w:rFonts w:hint="eastAsia"/>
         </w:rPr>
-        <w:t>檢舉數量</w:t>
+        <w:t>問題回報數量</w:t>
       </w:r>
     </w:p>
     <w:p>

</xml_diff>